<commit_message>
Atualiza plano, README e programa em Word; registra as decisões 9 a 11
Co-Authored-By: Claude Opus 5.5 <noreply@anthropic.com>
</commit_message>
<xml_diff>
--- a/Programa_Metodos_Tecnicas_Pesquisa_Quantitativa.docx
+++ b/Programa_Metodos_Tecnicas_Pesquisa_Quantitativa.docx
@@ -443,7 +443,7 @@
                 <w:i w:val="0"/>
                 <w:sz w:val="20"/>
               </w:rPr>
-              <w:t>Google Colab (notebooks Jupyter em Python); APIs públicas de dados (IBGE/SIDRA, Banco Central/SGS, Ipeadata, CVM)</w:t>
+              <w:t>Google Colab (notebooks Jupyter em Python, publicados pré-executados); APIs e dados abertos (IBGE/SIDRA, Banco Central/SGS, Ipeadata, CVM, ANP, ANTT/DNIT, Receita Federal)</w:t>
             </w:r>
           </w:p>
         </w:tc>
@@ -498,7 +498,7 @@
                 <w:i w:val="0"/>
                 <w:sz w:val="20"/>
               </w:rPr>
-              <w:t>3 atividades avaliativas individuais + prova final (15º encontro)</w:t>
+              <w:t>3 atividades avaliativas individuais (5º, 9º e 14º encontros) + prova final (15º encontro)</w:t>
             </w:r>
           </w:p>
         </w:tc>
@@ -533,7 +533,7 @@
           <w:i w:val="0"/>
           <w:sz w:val="22"/>
         </w:rPr>
-        <w:t>Introdução à pesquisa quantitativa: conceitos e características, tipos de pesquisa quantitativa, formulação de hipóteses e objetivos de pesquisa. Planejamento da pesquisa: etapas do processo de pesquisa quantitativa, seleção de amostra, escolha de instrumentos de coleta de dados, cálculo do tamanho da amostra. Coleta de dados: técnicas de coleta de dados quantitativos, questionários, escalas, entrevistas, testes, observação sistemática, registros documentais. Análise de dados: técnicas de análise estatística, medidas descritivas, inferência estatística, testes de hipóteses, correlação e regressão. Interpretação e apresentação de resultados: interpretação de resultados, comunicação dos resultados, apresentação de tabelas e gráficos, relatórios de pesquisa quantitativa. Aspectos éticos na pesquisa quantitativa.</w:t>
+        <w:t>Introdução à pesquisa quantitativa: conceitos, características e tipos de pesquisa; problema, objetivos e hipóteses; variáveis e níveis de mensuração. Dados e estatística descritiva: fontes de dados secundários e acesso por API, distribuições de frequência, medidas de tendência central, de dispersão e de forma da distribuição. População, amostra e mensuração: delineamentos de pesquisa, técnicas de amostragem, distribuição amostral, erro padrão, margem de erro e cálculo do tamanho da amostra; instrumentos de coleta de dados, escalas, validade e confiabilidade. Inferência estatística: intervalos de confiança, testes de hipóteses paramétricos e não paramétricos, teste qui-quadrado e análise de variância. Associação e modelagem: correlação, regressão linear simples e múltipla e regressão logística. Interpretação e comunicação de resultados: tabelas, gráficos e relatórios de pesquisa reprodutíveis. Aspectos éticos na pesquisa quantitativa e uso responsável de inteligência artificial generativa.</w:t>
       </w:r>
     </w:p>
     <w:p>
@@ -616,7 +616,7 @@
           <w:i w:val="0"/>
           <w:sz w:val="22"/>
         </w:rPr>
-        <w:t>Ao final da disciplina, espera-se que o estudante seja capaz de: (i) distinguir os tipos de pesquisa quantitativa e identificar as situações organizacionais em que cada delineamento é adequado; (ii) formular problemas, objetivos e hipóteses de pesquisa operacionalizáveis; (iii) selecionar amostras e calcular seu tamanho conforme os parâmetros do estudo; (iv) construir e validar instrumentos de coleta, com destaque para questionários e escalas; (v) organizar, tratar e analisar dados em notebooks Jupyter no Google Colab, aplicando técnicas de estatística descritiva e inferencial, testes de hipóteses, correlação e regressão; (vi) interpretar e comunicar resultados por meio de tabelas, gráficos e relatórios de pesquisa reprodutíveis; (vii) reconhecer e aplicar os princípios éticos que regulam a pesquisa com seres humanos no Brasil.</w:t>
+        <w:t>Ao final da disciplina, espera-se que o estudante seja capaz de: (i) distinguir os tipos de pesquisa quantitativa e identificar as situações organizacionais em que cada delineamento é adequado; (ii) formular problemas, objetivos e hipóteses de pesquisa operacionalizáveis; (iii) descrever um conjunto de dados escolhendo a medida adequada ao nível de mensuração e à forma da distribuição; (iv) obter dados de fontes oficiais brasileiras por meio de APIs públicas; (v) planejar amostras probabilísticas e calcular o seu tamanho a partir da margem de erro aceita; (vi) construir instrumentos de coleta, com destaque para questionários e escalas, e avaliar a sua confiabilidade; (vii) escolher, executar no Google Colab e interpretar intervalos de confiança, testes de hipóteses, correlação e modelos de regressão linear e logística; (viii) comunicar resultados por meio de tabelas, gráficos e relatórios de pesquisa reprodutíveis, com uso verificado e registrado de inteligência artificial generativa; (ix) reconhecer e aplicar os princípios éticos que regulam a pesquisa com seres humanos e o uso de dados no Brasil.</w:t>
       </w:r>
     </w:p>
     <w:p>
@@ -649,7 +649,7 @@
           <w:i w:val="0"/>
           <w:sz w:val="22"/>
         </w:rPr>
-        <w:t>As aulas ocorrem integralmente no laboratório de informática e adotam o Google Colab como ambiente de trabalho. Cada encontro se organiza em dois movimentos articulados: uma exposição dialogada dos conceitos e, em seguida, uma atividade prática em notebook Jupyter preparado pelo professor, no qual os estudantes executam, completam e modificam códigos em Python aplicados a bases de dados reais do contexto brasileiro. Os notebooks seguem o formato de preenchimento guiado: parte do código é fornecida e parte é completada pelo estudante durante a aula, o que dispensa conhecimento prévio de programação e permite progressão gradual ao longo do semestre. Não se trata de uma disciplina de programação: o Python opera como instrumento de cálculo e visualização, e a ênfase permanece na lógica da pesquisa quantitativa, na interpretação dos resultados e na tomada de decisão metodológica.</w:t>
+        <w:t>As aulas ocorrem integralmente no laboratório de informática e adotam o Google Colab como ambiente de trabalho. A disciplina se organiza em quatro módulos, com a estatística como base: (I) pesquisa quantitativa, dados e estatística descritiva; (II) população, amostra e mensuração; (III) inferência estatística; (IV) associação, modelagem e comunicação. Cada encontro articula três movimentos: a exposição dialogada do conceito de pesquisa, um bloco de estatística com a mesma estrutura em todos os encontros (a pergunta que a estatística responde, o conceito, a fórmula, um exemplo resolvido passo a passo com dado real, o código e a frase de leitura do resultado) e uma atividade prática em notebook Jupyter preparado pelo professor. Os notebooks são publicados pré-executados, com as saídas salvas, e o estudante não escreve código: executa células prontas, altera apenas os valores declarados no bloco de configuração e redige a frase de leitura de cada resultado, conferido por uma função que o compara com o valor esperado. Não há cálculo à mão: a fórmula é explicada para que se entenda de onde vem o número, e o número sai de uma célula executada. Não se trata de uma disciplina de programação: o Python opera como instrumento de cálculo e visualização, e a ênfase permanece na lógica da pesquisa quantitativa, na interpretação dos resultados e na decisão metodológica.</w:t>
       </w:r>
     </w:p>
     <w:p>
@@ -681,7 +681,23 @@
           <w:i w:val="0"/>
           <w:sz w:val="22"/>
         </w:rPr>
-        <w:t>Todas as atividades e avaliações da disciplina são individuais. Ao longo do semestre, cada estudante desenvolve um projeto individual de pesquisa quantitativa com dados secundários das fontes oficiais trabalhadas em aula (IBGE, Banco Central, IPEA e CVM): formula um problema e hipóteses sobre um tema empresarial ou econômico de seu interesse, delimita as variáveis e a base de dados pertinente, executa as análises em notebook próprio e redige o relatório final. O uso de dados secundários garante que cada estudante disponha de material empírico suficiente sem depender de coleta de campo, ao mesmo tempo em que as técnicas de coleta primária (questionários, escalas, entrevistas estruturadas) são exercitadas em atividades práticas durante as aulas. O desenvolvimento do projeto é acompanhado pelo professor por meio dos notebooks compartilhados no Colab, com devolutivas ao longo do semestre.</w:t>
+        <w:t>Todas as atividades e avaliações da disciplina são individuais. Ao longo do semestre, cada estudante desenvolve um projeto individual de pesquisa quantitativa com dados secundários das fontes oficiais trabalhadas em aula (IBGE, Banco Central, IPEA, CVM, ANP e Receita Federal, entre outras): formula um problema e hipóteses sobre um tema empresarial ou econômico de seu interesse, delimita as variáveis e a base de dados pertinente, executa as análises em notebook próprio e redige o relatório final. O uso de dados secundários garante que cada estudante disponha de material empírico suficiente sem depender de coleta de campo, ao mesmo tempo em que as técnicas de coleta primária (questionários, escalas, entrevistas estruturadas) são exercitadas em atividades práticas durante as aulas. O desenvolvimento do projeto é acompanhado pelo professor por meio dos notebooks compartilhados no Colab, com devolutivas ao longo do semestre.</w:t>
+      </w:r>
+    </w:p>
+    <w:p>
+      <w:pPr>
+        <w:spacing w:before="0" w:after="160" w:line="276" w:lineRule="auto"/>
+        <w:ind w:firstLine="709"/>
+        <w:jc w:val="both"/>
+      </w:pPr>
+      <w:r>
+        <w:rPr>
+          <w:rFonts w:ascii="Source Sans Pro" w:hAnsi="Source Sans Pro" w:cs="Source Sans Pro"/>
+          <w:b w:val="0"/>
+          <w:i w:val="0"/>
+          <w:sz w:val="22"/>
+        </w:rPr>
+        <w:t>O uso de assistentes de inteligência artificial generativa é permitido e incentivado nas aulas, no projeto individual e nas partes práticas das avaliações, com uma exigência: o registro do pedido feito ao assistente e da checagem realizada sobre a resposta. O uso é vedado na parte conceitual da primeira atividade avaliativa e da prova final. A regra da disciplina é que a IA explica, o código calcula, e o estudante confere e escreve: nenhum número entra no relatório sem ter saído de uma célula executada e conferida.</w:t>
       </w:r>
     </w:p>
     <w:p>
@@ -1247,6 +1263,316 @@
           </w:p>
         </w:tc>
       </w:tr>
+      <w:tr>
+        <w:tc>
+          <w:tcPr>
+            <w:tcW w:type="dxa" w:w="1474"/>
+            <w:tcMar>
+              <w:top w:w="60" w:type="dxa"/>
+              <w:bottom w:w="60" w:type="dxa"/>
+              <w:left w:w="100" w:type="dxa"/>
+              <w:right w:w="100" w:type="dxa"/>
+            </w:tcMar>
+          </w:tcPr>
+          <w:p>
+            <w:pPr>
+              <w:spacing w:after="0" w:line="240" w:lineRule="auto"/>
+            </w:pPr>
+            <w:r>
+              <w:rPr>
+                <w:rFonts w:ascii="Source Sans Pro" w:hAnsi="Source Sans Pro" w:cs="Source Sans Pro"/>
+                <w:b w:val="0"/>
+                <w:i w:val="0"/>
+                <w:sz w:val="18"/>
+              </w:rPr>
+              <w:t>ANP</w:t>
+            </w:r>
+          </w:p>
+        </w:tc>
+        <w:tc>
+          <w:tcPr>
+            <w:tcW w:type="dxa" w:w="2494"/>
+            <w:tcMar>
+              <w:top w:w="60" w:type="dxa"/>
+              <w:bottom w:w="60" w:type="dxa"/>
+              <w:left w:w="100" w:type="dxa"/>
+              <w:right w:w="100" w:type="dxa"/>
+            </w:tcMar>
+          </w:tcPr>
+          <w:p>
+            <w:pPr>
+              <w:spacing w:after="0" w:line="240" w:lineRule="auto"/>
+            </w:pPr>
+            <w:r>
+              <w:rPr>
+                <w:rFonts w:ascii="Source Sans Pro" w:hAnsi="Source Sans Pro" w:cs="Source Sans Pro"/>
+                <w:b w:val="0"/>
+                <w:i w:val="0"/>
+                <w:sz w:val="18"/>
+              </w:rPr>
+              <w:t>Série Histórica de Preços de Combustíveis (SHPC) e processamento de petróleo</w:t>
+            </w:r>
+          </w:p>
+        </w:tc>
+        <w:tc>
+          <w:tcPr>
+            <w:tcW w:type="dxa" w:w="2041"/>
+            <w:tcMar>
+              <w:top w:w="60" w:type="dxa"/>
+              <w:bottom w:w="60" w:type="dxa"/>
+              <w:left w:w="100" w:type="dxa"/>
+              <w:right w:w="100" w:type="dxa"/>
+            </w:tcMar>
+          </w:tcPr>
+          <w:p>
+            <w:pPr>
+              <w:spacing w:after="0" w:line="240" w:lineRule="auto"/>
+            </w:pPr>
+            <w:r>
+              <w:rPr>
+                <w:rFonts w:ascii="Source Sans Pro" w:hAnsi="Source Sans Pro" w:cs="Source Sans Pro"/>
+                <w:b w:val="0"/>
+                <w:i w:val="0"/>
+                <w:sz w:val="18"/>
+              </w:rPr>
+              <w:t>Arquivos CSV abertos lidos com pandas</w:t>
+            </w:r>
+          </w:p>
+        </w:tc>
+        <w:tc>
+          <w:tcPr>
+            <w:tcW w:type="dxa" w:w="3061"/>
+            <w:tcMar>
+              <w:top w:w="60" w:type="dxa"/>
+              <w:bottom w:w="60" w:type="dxa"/>
+              <w:left w:w="100" w:type="dxa"/>
+              <w:right w:w="100" w:type="dxa"/>
+            </w:tcMar>
+          </w:tcPr>
+          <w:p>
+            <w:pPr>
+              <w:spacing w:after="0" w:line="240" w:lineRule="auto"/>
+            </w:pPr>
+            <w:r>
+              <w:rPr>
+                <w:rFonts w:ascii="Source Sans Pro" w:hAnsi="Source Sans Pro" w:cs="Source Sans Pro"/>
+                <w:b w:val="0"/>
+                <w:i w:val="0"/>
+                <w:sz w:val="18"/>
+              </w:rPr>
+              <w:t>Preço de revenda por posto e município; cadastro de postos usado nos exercícios de amostragem</w:t>
+            </w:r>
+          </w:p>
+        </w:tc>
+      </w:tr>
+      <w:tr>
+        <w:tc>
+          <w:tcPr>
+            <w:tcW w:type="dxa" w:w="1474"/>
+            <w:tcMar>
+              <w:top w:w="60" w:type="dxa"/>
+              <w:bottom w:w="60" w:type="dxa"/>
+              <w:left w:w="100" w:type="dxa"/>
+              <w:right w:w="100" w:type="dxa"/>
+            </w:tcMar>
+            <w:shd w:val="clear" w:fill="F5F5F5"/>
+          </w:tcPr>
+          <w:p>
+            <w:pPr>
+              <w:spacing w:after="0" w:line="240" w:lineRule="auto"/>
+            </w:pPr>
+            <w:r>
+              <w:rPr>
+                <w:rFonts w:ascii="Source Sans Pro" w:hAnsi="Source Sans Pro" w:cs="Source Sans Pro"/>
+                <w:b w:val="0"/>
+                <w:i w:val="0"/>
+                <w:sz w:val="18"/>
+              </w:rPr>
+              <w:t>ANTT e DNIT</w:t>
+            </w:r>
+          </w:p>
+        </w:tc>
+        <w:tc>
+          <w:tcPr>
+            <w:tcW w:type="dxa" w:w="2494"/>
+            <w:tcMar>
+              <w:top w:w="60" w:type="dxa"/>
+              <w:bottom w:w="60" w:type="dxa"/>
+              <w:left w:w="100" w:type="dxa"/>
+              <w:right w:w="100" w:type="dxa"/>
+            </w:tcMar>
+            <w:shd w:val="clear" w:fill="F5F5F5"/>
+          </w:tcPr>
+          <w:p>
+            <w:pPr>
+              <w:spacing w:after="0" w:line="240" w:lineRule="auto"/>
+            </w:pPr>
+            <w:r>
+              <w:rPr>
+                <w:rFonts w:ascii="Source Sans Pro" w:hAnsi="Source Sans Pro" w:cs="Source Sans Pro"/>
+                <w:b w:val="0"/>
+                <w:i w:val="0"/>
+                <w:sz w:val="18"/>
+              </w:rPr>
+              <w:t>Catálogos de dados abertos (CKAN)</w:t>
+            </w:r>
+          </w:p>
+        </w:tc>
+        <w:tc>
+          <w:tcPr>
+            <w:tcW w:type="dxa" w:w="2041"/>
+            <w:tcMar>
+              <w:top w:w="60" w:type="dxa"/>
+              <w:bottom w:w="60" w:type="dxa"/>
+              <w:left w:w="100" w:type="dxa"/>
+              <w:right w:w="100" w:type="dxa"/>
+            </w:tcMar>
+            <w:shd w:val="clear" w:fill="F5F5F5"/>
+          </w:tcPr>
+          <w:p>
+            <w:pPr>
+              <w:spacing w:after="0" w:line="240" w:lineRule="auto"/>
+            </w:pPr>
+            <w:r>
+              <w:rPr>
+                <w:rFonts w:ascii="Source Sans Pro" w:hAnsi="Source Sans Pro" w:cs="Source Sans Pro"/>
+                <w:b w:val="0"/>
+                <w:i w:val="0"/>
+                <w:sz w:val="18"/>
+              </w:rPr>
+              <w:t>API CKAN pública, sem chave</w:t>
+            </w:r>
+          </w:p>
+        </w:tc>
+        <w:tc>
+          <w:tcPr>
+            <w:tcW w:type="dxa" w:w="3061"/>
+            <w:tcMar>
+              <w:top w:w="60" w:type="dxa"/>
+              <w:bottom w:w="60" w:type="dxa"/>
+              <w:left w:w="100" w:type="dxa"/>
+              <w:right w:w="100" w:type="dxa"/>
+            </w:tcMar>
+            <w:shd w:val="clear" w:fill="F5F5F5"/>
+          </w:tcPr>
+          <w:p>
+            <w:pPr>
+              <w:spacing w:after="0" w:line="240" w:lineRule="auto"/>
+            </w:pPr>
+            <w:r>
+              <w:rPr>
+                <w:rFonts w:ascii="Source Sans Pro" w:hAnsi="Source Sans Pro" w:cs="Source Sans Pro"/>
+                <w:b w:val="0"/>
+                <w:i w:val="0"/>
+                <w:sz w:val="18"/>
+              </w:rPr>
+              <w:t>Busca de bases em catálogo aberto; transporte de cargas e infraestrutura rodoviária</w:t>
+            </w:r>
+          </w:p>
+        </w:tc>
+      </w:tr>
+      <w:tr>
+        <w:tc>
+          <w:tcPr>
+            <w:tcW w:type="dxa" w:w="1474"/>
+            <w:tcMar>
+              <w:top w:w="60" w:type="dxa"/>
+              <w:bottom w:w="60" w:type="dxa"/>
+              <w:left w:w="100" w:type="dxa"/>
+              <w:right w:w="100" w:type="dxa"/>
+            </w:tcMar>
+          </w:tcPr>
+          <w:p>
+            <w:pPr>
+              <w:spacing w:after="0" w:line="240" w:lineRule="auto"/>
+            </w:pPr>
+            <w:r>
+              <w:rPr>
+                <w:rFonts w:ascii="Source Sans Pro" w:hAnsi="Source Sans Pro" w:cs="Source Sans Pro"/>
+                <w:b w:val="0"/>
+                <w:i w:val="0"/>
+                <w:sz w:val="18"/>
+              </w:rPr>
+              <w:t>Receita Federal</w:t>
+            </w:r>
+          </w:p>
+        </w:tc>
+        <w:tc>
+          <w:tcPr>
+            <w:tcW w:type="dxa" w:w="2494"/>
+            <w:tcMar>
+              <w:top w:w="60" w:type="dxa"/>
+              <w:bottom w:w="60" w:type="dxa"/>
+              <w:left w:w="100" w:type="dxa"/>
+              <w:right w:w="100" w:type="dxa"/>
+            </w:tcMar>
+          </w:tcPr>
+          <w:p>
+            <w:pPr>
+              <w:spacing w:after="0" w:line="240" w:lineRule="auto"/>
+            </w:pPr>
+            <w:r>
+              <w:rPr>
+                <w:rFonts w:ascii="Source Sans Pro" w:hAnsi="Source Sans Pro" w:cs="Source Sans Pro"/>
+                <w:b w:val="0"/>
+                <w:i w:val="0"/>
+                <w:sz w:val="18"/>
+              </w:rPr>
+              <w:t>Base CNPJ: tabelas de municípios e de atividades (CNAE)</w:t>
+            </w:r>
+          </w:p>
+        </w:tc>
+        <w:tc>
+          <w:tcPr>
+            <w:tcW w:type="dxa" w:w="2041"/>
+            <w:tcMar>
+              <w:top w:w="60" w:type="dxa"/>
+              <w:bottom w:w="60" w:type="dxa"/>
+              <w:left w:w="100" w:type="dxa"/>
+              <w:right w:w="100" w:type="dxa"/>
+            </w:tcMar>
+          </w:tcPr>
+          <w:p>
+            <w:pPr>
+              <w:spacing w:after="0" w:line="240" w:lineRule="auto"/>
+            </w:pPr>
+            <w:r>
+              <w:rPr>
+                <w:rFonts w:ascii="Source Sans Pro" w:hAnsi="Source Sans Pro" w:cs="Source Sans Pro"/>
+                <w:b w:val="0"/>
+                <w:i w:val="0"/>
+                <w:sz w:val="18"/>
+              </w:rPr>
+              <w:t>Download direto (WebDAV com token público)</w:t>
+            </w:r>
+          </w:p>
+        </w:tc>
+        <w:tc>
+          <w:tcPr>
+            <w:tcW w:type="dxa" w:w="3061"/>
+            <w:tcMar>
+              <w:top w:w="60" w:type="dxa"/>
+              <w:bottom w:w="60" w:type="dxa"/>
+              <w:left w:w="100" w:type="dxa"/>
+              <w:right w:w="100" w:type="dxa"/>
+            </w:tcMar>
+          </w:tcPr>
+          <w:p>
+            <w:pPr>
+              <w:spacing w:after="0" w:line="240" w:lineRule="auto"/>
+            </w:pPr>
+            <w:r>
+              <w:rPr>
+                <w:rFonts w:ascii="Source Sans Pro" w:hAnsi="Source Sans Pro" w:cs="Source Sans Pro"/>
+                <w:b w:val="0"/>
+                <w:i w:val="0"/>
+                <w:sz w:val="18"/>
+              </w:rPr>
+              <w:t>Universo de referência para o planejamento de amostras de empresas</w:t>
+            </w:r>
+          </w:p>
+        </w:tc>
+      </w:tr>
     </w:tbl>
     <w:p>
       <w:pPr>
@@ -1279,7 +1605,7 @@
           <w:color w:val="000000"/>
           <w:sz w:val="22"/>
         </w:rPr>
-        <w:t>Unidade I – Fundamentos da pesquisa quantitativa (encontros 1 a 4)</w:t>
+        <w:t>Módulo I – Pesquisa quantitativa, dados e estatística descritiva (encontros 1 a 5)</w:t>
       </w:r>
     </w:p>
     <w:p>
@@ -1304,7 +1630,7 @@
           <w:i w:val="0"/>
           <w:sz w:val="22"/>
         </w:rPr>
-        <w:t>Apresentação do programa, do sistema de avaliação e do projeto individual de pesquisa. Introdução à pesquisa quantitativa: conceitos, características, pressupostos do paradigma quantitativo e distinções em relação à abordagem qualitativa. Prática no Colab: ambientação ao Google Colab e aos notebooks Jupyter (células de texto e de código, execução); primeiro notebook com extração simples do CEMPRE/IBGE (número de empresas por setor no Maranhão e no Brasil).</w:t>
+        <w:t>Apresentação do programa, do sistema de avaliação, do uso de inteligência artificial e do projeto individual de pesquisa. Introdução à pesquisa quantitativa: ciência e senso comum, características e pressupostos do paradigma quantitativo. Estatística: ler um conjunto de dados (dado e informação, observação e variável, frequência absoluta e relativa, porcentagem e o denominador, razão, proporção e taxa, ponto percentual e número-índice). Prática no Colab: ambientação ao Google Colab, o que é uma API e primeira extração do CEMPRE/IBGE.</w:t>
       </w:r>
     </w:p>
     <w:p>
@@ -1329,7 +1655,7 @@
           <w:i w:val="0"/>
           <w:sz w:val="22"/>
         </w:rPr>
-        <w:t>Tipos de pesquisa quantitativa: descritiva, correlacional, experimental e quase-experimental; o levantamento (survey) nas pesquisas em Administração. Prática no Colab: leitura de dados com pandas a partir do SIDRA (sidrapy), com a demografia empresarial do CEMPRE (aberturas, fechamentos e sobrevivência de empresas por porte e setor); discussão sobre os tipos de pesquisa que cada base permite sustentar.</w:t>
+        <w:t>Variáveis, tipos de dado e níveis de mensuração (nominal, ordinal, intervalar e de razão). Estatística: a regra da medida, segundo a qual o nível de mensuração decide a medida de posição, a de dispersão e o gráfico; frequência acumulada em dados ordinais. Prática no Colab: descrição de bases da PAS e da PMC/IBGE.</w:t>
       </w:r>
     </w:p>
     <w:p>
@@ -1354,7 +1680,7 @@
           <w:i w:val="0"/>
           <w:sz w:val="22"/>
         </w:rPr>
-        <w:t>Formulação do problema de pesquisa, objetivos e hipóteses. Variáveis: classificação, níveis de mensuração e operacionalização de conceitos. Prática no Colab: classificação de variáveis sobre a PAS e a PMC (receita, pessoal ocupado, porte, setor, região); início da definição do tema, do problema e das hipóteses do projeto individual, a partir de cardápio de temas e bases sugerido pelo professor.</w:t>
+        <w:t>Problema, objetivos, hipóteses e matriz de amarração; escolha da base do projeto individual. Estatística: medidas de tendência central (média, média ponderada, mediana e moda) e a escolha da medida pelo nível, pela forma da distribuição e pelos valores extremos. Prática no Colab: séries do Banco Central (SGS) e do Ipeadata e preços de combustíveis da ANP.</w:t>
       </w:r>
     </w:p>
     <w:p>
@@ -1379,24 +1705,7 @@
           <w:i w:val="0"/>
           <w:sz w:val="22"/>
         </w:rPr>
-        <w:t>Etapas do processo de pesquisa quantitativa e planejamento do estudo: delineamento, cronograma, matriz de amarração metodológica. Prática no Colab: consumo de séries do Ipeadata (ipeadatapy) e do SGS (python-bcb) para construção do contexto econômico de um problema de pesquisa; delimitação da base de dados e das variáveis do projeto individual e elaboração da matriz de amarração.</w:t>
-      </w:r>
-    </w:p>
-    <w:p>
-      <w:pPr>
-        <w:keepNext/>
-        <w:spacing w:before="200" w:after="160" w:line="276" w:lineRule="auto"/>
-        <w:jc w:val="left"/>
-      </w:pPr>
-      <w:r>
-        <w:rPr>
-          <w:rFonts w:ascii="Montserrat" w:hAnsi="Montserrat" w:cs="Montserrat"/>
-          <w:b/>
-          <w:i w:val="0"/>
-          <w:color w:val="000000"/>
-          <w:sz w:val="22"/>
-        </w:rPr>
-        <w:t>Unidade II – Amostragem, instrumentos e coleta de dados (encontros 5 a 8)</w:t>
+        <w:t>O projeto e a base de dados: mapa de fontes de dados para a Administração, critérios de escolha, qualidade do dado e ética no uso de dados secundários. Estatística: medidas de dispersão (amplitude, variância, desvio padrão, coeficiente de variação e intervalo interquartílico) e forma da distribuição (classes, histograma, quartis, boxplot, escore z e assimetria). Prática no Colab: demonstrações financeiras das companhias abertas (CVM).</w:t>
       </w:r>
     </w:p>
     <w:p>
@@ -1421,7 +1730,24 @@
           <w:i w:val="0"/>
           <w:sz w:val="22"/>
         </w:rPr>
-        <w:t>Seleção de amostra: população e amostra, técnicas probabilísticas (aleatória simples, sistemática, estratificada, por conglomerados) e não probabilísticas (por conveniência, por cotas, bola de neve). Cálculo do tamanho da amostra: margem de erro e nível de confiança. Prática no Colab: implementação de sorteios amostrais sobre um cadastro real de empresas extraído do CEMPRE e cálculo interativo do tamanho da amostra, com visualização do efeito da margem de erro e do nível de confiança sobre o n necessário.</w:t>
+        <w:t>Atividade avaliativa 1 (AV1): estatística descritiva no Colab, com uma parte conceitual sem consulta e uma parte prática, acompanhada da primeira entrega do projeto individual (tema, pergunta de pesquisa e base escolhida, com a carga dos dados por API funcionando).</w:t>
+      </w:r>
+    </w:p>
+    <w:p>
+      <w:pPr>
+        <w:keepNext/>
+        <w:spacing w:before="200" w:after="160" w:line="276" w:lineRule="auto"/>
+        <w:jc w:val="left"/>
+      </w:pPr>
+      <w:r>
+        <w:rPr>
+          <w:rFonts w:ascii="Montserrat" w:hAnsi="Montserrat" w:cs="Montserrat"/>
+          <w:b/>
+          <w:i w:val="0"/>
+          <w:color w:val="000000"/>
+          <w:sz w:val="22"/>
+        </w:rPr>
+        <w:t>Módulo II – População, amostra e mensuração (encontros 6 a 9)</w:t>
       </w:r>
     </w:p>
     <w:p>
@@ -1446,7 +1772,7 @@
           <w:i w:val="0"/>
           <w:sz w:val="22"/>
         </w:rPr>
-        <w:t>Instrumentos de coleta de dados: construção de questionários e escalas (Likert, diferencial semântico); validade e confiabilidade; pré-teste do instrumento. Prática no Colab: cálculo do alfa de Cronbach sobre dados de escala aplicada a gestores; exercício individual de construção de um questionário no Google Formulários a partir de cenário empresarial proposto pelo professor, com avaliação cruzada entre colegas.</w:t>
+        <w:t>Delineamentos de pesquisa: descritivo, correlacional, experimental, quase-experimental e levantamento (survey). População, cadastro, amostra, parâmetro e estatística; amostragem não probabilística e seus vieses. Prática no Colab: sorteio de amostras sobre um cadastro real de postos de combustível (ANP) e medida do erro de amostragem.</w:t>
       </w:r>
     </w:p>
     <w:p>
@@ -1471,7 +1797,7 @@
           <w:i w:val="0"/>
           <w:sz w:val="22"/>
         </w:rPr>
-        <w:t>Demais técnicas de coleta: entrevistas estruturadas, testes, observação sistemática e registros documentais. Aspectos éticos na pesquisa quantitativa: Resoluções CNS nº 466/2012 e nº 510/2016, Termo de Consentimento Livre e Esclarecido, Comitês de Ética em Pesquisa e Plataforma Brasil. Prática no Colab: registros documentais como dado quantitativo, com importação das demonstrações financeiras da CVM (dados abertos); pré-teste dos questionários do exercício da aula anterior, com importação das respostas para o notebook.</w:t>
+        <w:t>Técnicas probabilísticas de amostragem: aleatória simples, sistemática, estratificada e por conglomerados, escolhidas pelo formato do cadastro. Estatística: distribuição amostral, erro padrão e teorema central do limite, por simulação. Prática no Colab: mil amostras sorteadas do mesmo cadastro.</w:t>
       </w:r>
     </w:p>
     <w:p>
@@ -1484,7 +1810,7 @@
           <w:rFonts w:ascii="Source Sans Pro" w:hAnsi="Source Sans Pro" w:cs="Source Sans Pro"/>
           <w:b/>
           <w:i w:val="0"/>
-          <w:color w:val="8D0333"/>
+          <w:color w:val="000000"/>
           <w:sz w:val="22"/>
         </w:rPr>
         <w:t xml:space="preserve">Encontro 8 – </w:t>
@@ -1496,24 +1822,7 @@
           <w:i w:val="0"/>
           <w:sz w:val="22"/>
         </w:rPr>
-        <w:t>Atividade avaliativa 1: prova individual sobre os conteúdos das Unidades I e II, com componente prático em notebook (classificação de variáveis, plano amostral e cálculo de tamanho de amostra sobre extrato do CEMPRE), acompanhada da entrega da primeira etapa do projeto individual (problema, hipóteses, variáveis e base de dados escolhida).</w:t>
-      </w:r>
-    </w:p>
-    <w:p>
-      <w:pPr>
-        <w:keepNext/>
-        <w:spacing w:before="200" w:after="160" w:line="276" w:lineRule="auto"/>
-        <w:jc w:val="left"/>
-      </w:pPr>
-      <w:r>
-        <w:rPr>
-          <w:rFonts w:ascii="Montserrat" w:hAnsi="Montserrat" w:cs="Montserrat"/>
-          <w:b/>
-          <w:i w:val="0"/>
-          <w:color w:val="000000"/>
-          <w:sz w:val="22"/>
-        </w:rPr>
-        <w:t>Unidade III – Análise de dados (encontros 9 a 13)</w:t>
+        <w:t>Erro de amostragem aleatório e sistemático. Instrumentos de coleta de dados: questionários e escalas (Likert), validade e confiabilidade (alfa de Cronbach). Ética na coleta de dados primários: consentimento livre e esclarecido, Resolução CNS nº 510/2016 e Lei Geral de Proteção de Dados. Estatística: nível de confiança, margem de erro e cálculo do tamanho da amostra a partir do intervalo de confiança. Prática no Colab: simulador de tamanho de amostra.</w:t>
       </w:r>
     </w:p>
     <w:p>
@@ -1538,7 +1847,24 @@
           <w:i w:val="0"/>
           <w:sz w:val="22"/>
         </w:rPr>
-        <w:t>Estatística descritiva: medidas de tendência central (média, mediana, moda), medidas de dispersão (amplitude, variância, desvio padrão, coeficiente de variação), distribuições de frequência. Prática no Colab: cálculo de medidas descritivas sobre as demonstrações financeiras da CVM (receita, margem e endividamento de companhias abertas por setor), evidenciando o efeito de valores extremos e a escolha entre média e mediana em dados empresariais.</w:t>
+        <w:t>Atividade avaliativa 2 (AV2), sobre os Módulos I e II, inteiramente no Colab: descrição completa de uma base de dados, plano de amostragem justificado pelo cadastro e tamanho de amostra calculado, com registro do uso de inteligência artificial.</w:t>
+      </w:r>
+    </w:p>
+    <w:p>
+      <w:pPr>
+        <w:keepNext/>
+        <w:spacing w:before="200" w:after="160" w:line="276" w:lineRule="auto"/>
+        <w:jc w:val="left"/>
+      </w:pPr>
+      <w:r>
+        <w:rPr>
+          <w:rFonts w:ascii="Montserrat" w:hAnsi="Montserrat" w:cs="Montserrat"/>
+          <w:b/>
+          <w:i w:val="0"/>
+          <w:color w:val="000000"/>
+          <w:sz w:val="22"/>
+        </w:rPr>
+        <w:t>Módulo III – Inferência estatística (encontros 10 a 12)</w:t>
       </w:r>
     </w:p>
     <w:p>
@@ -1563,7 +1889,7 @@
           <w:i w:val="0"/>
           <w:sz w:val="22"/>
         </w:rPr>
-        <w:t>Apresentação de dados: princípios de construção de tabelas e gráficos; boas práticas de visualização. Prática no Colab: produção de gráficos (barras, histogramas, boxplots, dispersão) com matplotlib sobre séries do Banco Central (crédito PJ, inadimplência, juros); na segunda parte da aula, tratamento e descritivas iniciais da base do projeto individual de cada estudante, com acompanhamento do professor.</w:t>
+        <w:t>Intervalo de confiança para a média e para a proporção, e o que o nível de confiança significa. A lógica do teste de hipóteses: hipóteses nula e alternativa, nível de significância, valor-p e decisão. Prática no Colab: teste t de uma amostra, com a leitura escrita de cada resultado.</w:t>
       </w:r>
     </w:p>
     <w:p>
@@ -1588,7 +1914,7 @@
           <w:i w:val="0"/>
           <w:sz w:val="22"/>
         </w:rPr>
-        <w:t>Inferência estatística: distribuição normal, estimação por ponto e por intervalo, intervalos de confiança e a lógica dos testes de hipóteses (hipótese nula, nível de significância, valor-p). Prática no Colab: simulação do teorema central do limite; testes t de Student e qui-quadrado com a biblioteca scipy sobre dados empresariais reais (comparação de indicadores contábeis entre setores na base CVM; associação entre porte e sobrevivência de empresas no CEMPRE).</w:t>
+        <w:t>Erros tipo I e II e poder do teste. Testes t para uma amostra, para duas amostras independentes e para amostras pareadas; teste qui-quadrado de independência e de aderência; fluxograma de escolha do teste. Prática no Colab com dados da ANP e da CVM.</w:t>
       </w:r>
     </w:p>
     <w:p>
@@ -1601,7 +1927,7 @@
           <w:rFonts w:ascii="Source Sans Pro" w:hAnsi="Source Sans Pro" w:cs="Source Sans Pro"/>
           <w:b/>
           <w:i w:val="0"/>
-          <w:color w:val="8D0333"/>
+          <w:color w:val="000000"/>
           <w:sz w:val="22"/>
         </w:rPr>
         <w:t xml:space="preserve">Encontro 12 – </w:t>
@@ -1613,7 +1939,24 @@
           <w:i w:val="0"/>
           <w:sz w:val="22"/>
         </w:rPr>
-        <w:t>Atividade avaliativa 2: atividade prática individual no Colab, na qual cada estudante recebe um banco de dados empresarial preparado pelo professor a partir das fontes da disciplina (CVM ou IBGE) e um roteiro de questões de pesquisa, devendo produzir estatísticas descritivas, gráficos e testes de hipóteses, com interpretação dos resultados registrada no próprio notebook, entregue ao final da aula.</w:t>
+        <w:t>Análise de variância (ANOVA) de um fator; testes não paramétricos (Mann-Whitney, Wilcoxon e Kruskal-Wallis) e as situações em que o teste paramétrico não cabe; revisão do módulo. Prática no Colab guiada no projeto individual.</w:t>
+      </w:r>
+    </w:p>
+    <w:p>
+      <w:pPr>
+        <w:keepNext/>
+        <w:spacing w:before="200" w:after="160" w:line="276" w:lineRule="auto"/>
+        <w:jc w:val="left"/>
+      </w:pPr>
+      <w:r>
+        <w:rPr>
+          <w:rFonts w:ascii="Montserrat" w:hAnsi="Montserrat" w:cs="Montserrat"/>
+          <w:b/>
+          <w:i w:val="0"/>
+          <w:color w:val="000000"/>
+          <w:sz w:val="22"/>
+        </w:rPr>
+        <w:t>Módulo IV – Associação, modelagem e comunicação (encontros 13 a 15)</w:t>
       </w:r>
     </w:p>
     <w:p>
@@ -1638,24 +1981,7 @@
           <w:i w:val="0"/>
           <w:sz w:val="22"/>
         </w:rPr>
-        <w:t>Correlação (coeficiente de Pearson) e regressão linear simples: pressupostos, estimação, interpretação dos coeficientes e limites da análise. Prática no Colab: matriz de correlação entre séries macroeconômicas (Ipeadata, SGS) e desempenho setorial (PMC/PMS), com mapas de calor; ajuste e interpretação de regressões com statsmodels sobre dados da CVM; aplicação das técnicas pertinentes à base do projeto individual de cada estudante.</w:t>
-      </w:r>
-    </w:p>
-    <w:p>
-      <w:pPr>
-        <w:keepNext/>
-        <w:spacing w:before="200" w:after="160" w:line="276" w:lineRule="auto"/>
-        <w:jc w:val="left"/>
-      </w:pPr>
-      <w:r>
-        <w:rPr>
-          <w:rFonts w:ascii="Montserrat" w:hAnsi="Montserrat" w:cs="Montserrat"/>
-          <w:b/>
-          <w:i w:val="0"/>
-          <w:color w:val="000000"/>
-          <w:sz w:val="22"/>
-        </w:rPr>
-        <w:t>Unidade IV – Interpretação e comunicação dos resultados (encontros 14 e 15)</w:t>
+        <w:t>Correlação (coeficientes de Pearson e de Spearman) e os seus limites quanto à causalidade. Regressão linear simples e múltipla: coeficientes, coeficiente de determinação e resíduos. Regressão logística: log-odds, razão de chances e probabilidade prevista. Prática no Colab: ajuste de modelos sobre dados da CVM e sobre a base do projeto individual.</w:t>
       </w:r>
     </w:p>
     <w:p>
@@ -1668,7 +1994,7 @@
           <w:rFonts w:ascii="Source Sans Pro" w:hAnsi="Source Sans Pro" w:cs="Source Sans Pro"/>
           <w:b/>
           <w:i w:val="0"/>
-          <w:color w:val="8D0333"/>
+          <w:color w:val="000000"/>
           <w:sz w:val="22"/>
         </w:rPr>
         <w:t xml:space="preserve">Encontro 14 – </w:t>
@@ -1680,7 +2006,7 @@
           <w:i w:val="0"/>
           <w:sz w:val="22"/>
         </w:rPr>
-        <w:t>Interpretação e comunicação de resultados: estrutura do relatório de pesquisa quantitativa, redação de resultados e discussão, o notebook como instrumento de pesquisa reprodutível. Atividade avaliativa 3: entrega do relatório final individual acompanhado do notebook completo, com apresentação sintética dos resultados por estudante em formato de slide único (três a cinco minutos por apresentação), privilegiando a comunicação objetiva de problema, método e achados.</w:t>
+        <w:t>Interpretação e comunicação de resultados: estrutura do relatório de pesquisa quantitativa, correspondência entre a pergunta, a estatística e a frase de resultado, e leitura crítica de resultados publicados. Atividade avaliativa 3 (AV3): relatório final, notebook reprodutível e apresentação sintética do projeto individual.</w:t>
       </w:r>
     </w:p>
     <w:p>
@@ -1693,7 +2019,7 @@
           <w:rFonts w:ascii="Source Sans Pro" w:hAnsi="Source Sans Pro" w:cs="Source Sans Pro"/>
           <w:b/>
           <w:i w:val="0"/>
-          <w:color w:val="8D0333"/>
+          <w:color w:val="000000"/>
           <w:sz w:val="22"/>
         </w:rPr>
         <w:t xml:space="preserve">Encontro 15 – </w:t>
@@ -1738,7 +2064,7 @@
           <w:i w:val="0"/>
           <w:sz w:val="22"/>
         </w:rPr>
-        <w:t>A nota semestral corresponde à média aritmética das três atividades avaliativas, todas individuais: prova com componente prático em notebook (encontro 8), atividade prática de análise de dados no Colab (encontro 12) e projeto individual de pesquisa, composto pelo relatório final, pelo notebook reprodutível e pela apresentação sintética (encontro 14). A entrega dos notebooks das atividades práticas semanais, embora não pontuada isoladamente, integra o acompanhamento formativo e compõe critério de participação. O estudante que não alcançar a média exigida para aprovação direta realizará a prova final no 15º encontro, nos termos das normas de avaliação de desempenho acadêmico vigentes na UFMA. A frequência mínima obrigatória é de 75% da carga horária.</w:t>
+        <w:t>A nota semestral corresponde à média aritmética das três atividades avaliativas, todas individuais e realizadas no Google Colab: a AV1, de estatística descritiva, com a primeira entrega do projeto (encontro 5); a AV2, sobre os Módulos I e II, com a descrição de uma base e um plano de amostragem (encontro 9); e a AV3, o projeto individual de pesquisa, composto pelo relatório final, pelo notebook reprodutível e pela apresentação sintética (encontro 14). A entrega dos notebooks das atividades práticas semanais, embora não pontuada isoladamente, integra o acompanhamento formativo e compõe critério de participação. O uso de inteligência artificial é registrado em célula própria; o registro não desconta pontos, e a sua omissão constitui falta de honestidade acadêmica. O estudante que não alcançar a média exigida para aprovação direta realizará a prova final no 15º encontro, nos termos das normas de avaliação de desempenho acadêmico vigentes na UFMA. A frequência mínima obrigatória é de 75% da carga horária.</w:t>
       </w:r>
     </w:p>
     <w:p>
@@ -1773,6 +2099,39 @@
           <w:sz w:val="24"/>
         </w:rPr>
         <w:t>7.1 Básica</w:t>
+      </w:r>
+    </w:p>
+    <w:p>
+      <w:pPr>
+        <w:spacing w:before="0" w:after="120" w:line="276" w:lineRule="auto"/>
+        <w:jc w:val="left"/>
+      </w:pPr>
+      <w:r>
+        <w:rPr>
+          <w:rFonts w:ascii="Source Sans Pro" w:hAnsi="Source Sans Pro" w:cs="Source Sans Pro"/>
+          <w:b w:val="0"/>
+          <w:i w:val="0"/>
+          <w:sz w:val="22"/>
+        </w:rPr>
+        <w:t xml:space="preserve">GIL, Antonio Carlos. </w:t>
+      </w:r>
+      <w:r>
+        <w:rPr>
+          <w:rFonts w:ascii="Source Sans Pro" w:hAnsi="Source Sans Pro" w:cs="Source Sans Pro"/>
+          <w:b w:val="0"/>
+          <w:i/>
+          <w:sz w:val="22"/>
+        </w:rPr>
+        <w:t>Como elaborar projetos de pesquisa</w:t>
+      </w:r>
+      <w:r>
+        <w:rPr>
+          <w:rFonts w:ascii="Source Sans Pro" w:hAnsi="Source Sans Pro" w:cs="Source Sans Pro"/>
+          <w:b w:val="0"/>
+          <w:i w:val="0"/>
+          <w:sz w:val="22"/>
+        </w:rPr>
+        <w:t>. 7. ed. Barueri: Atlas, 2022.</w:t>
       </w:r>
     </w:p>
     <w:p>
@@ -1969,6 +2328,39 @@
           <w:i w:val="0"/>
           <w:sz w:val="22"/>
         </w:rPr>
+        <w:t xml:space="preserve">BLUMAN, Allan G. </w:t>
+      </w:r>
+      <w:r>
+        <w:rPr>
+          <w:rFonts w:ascii="Source Sans Pro" w:hAnsi="Source Sans Pro" w:cs="Source Sans Pro"/>
+          <w:b w:val="0"/>
+          <w:i/>
+          <w:sz w:val="22"/>
+        </w:rPr>
+        <w:t>Elementary statistics: a step by step approach</w:t>
+      </w:r>
+      <w:r>
+        <w:rPr>
+          <w:rFonts w:ascii="Source Sans Pro" w:hAnsi="Source Sans Pro" w:cs="Source Sans Pro"/>
+          <w:b w:val="0"/>
+          <w:i w:val="0"/>
+          <w:sz w:val="22"/>
+        </w:rPr>
+        <w:t>. 8. ed. New York: McGraw-Hill, 2012.</w:t>
+      </w:r>
+    </w:p>
+    <w:p>
+      <w:pPr>
+        <w:spacing w:before="0" w:after="120" w:line="276" w:lineRule="auto"/>
+        <w:jc w:val="left"/>
+      </w:pPr>
+      <w:r>
+        <w:rPr>
+          <w:rFonts w:ascii="Source Sans Pro" w:hAnsi="Source Sans Pro" w:cs="Source Sans Pro"/>
+          <w:b w:val="0"/>
+          <w:i w:val="0"/>
+          <w:sz w:val="22"/>
+        </w:rPr>
         <w:t xml:space="preserve">COOPER, Donald R.; SCHINDLER, Pamela S. </w:t>
       </w:r>
       <w:r>
@@ -2068,6 +2460,39 @@
           <w:i w:val="0"/>
           <w:sz w:val="22"/>
         </w:rPr>
+        <w:t xml:space="preserve">LAVILLE, Christian; DIONNE, Jean. </w:t>
+      </w:r>
+      <w:r>
+        <w:rPr>
+          <w:rFonts w:ascii="Source Sans Pro" w:hAnsi="Source Sans Pro" w:cs="Source Sans Pro"/>
+          <w:b w:val="0"/>
+          <w:i/>
+          <w:sz w:val="22"/>
+        </w:rPr>
+        <w:t>A construção do saber: manual de metodologia da pesquisa em ciências humanas</w:t>
+      </w:r>
+      <w:r>
+        <w:rPr>
+          <w:rFonts w:ascii="Source Sans Pro" w:hAnsi="Source Sans Pro" w:cs="Source Sans Pro"/>
+          <w:b w:val="0"/>
+          <w:i w:val="0"/>
+          <w:sz w:val="22"/>
+        </w:rPr>
+        <w:t>. Porto Alegre: Artmed, 1999.</w:t>
+      </w:r>
+    </w:p>
+    <w:p>
+      <w:pPr>
+        <w:spacing w:before="0" w:after="120" w:line="276" w:lineRule="auto"/>
+        <w:jc w:val="left"/>
+      </w:pPr>
+      <w:r>
+        <w:rPr>
+          <w:rFonts w:ascii="Source Sans Pro" w:hAnsi="Source Sans Pro" w:cs="Source Sans Pro"/>
+          <w:b w:val="0"/>
+          <w:i w:val="0"/>
+          <w:sz w:val="22"/>
+        </w:rPr>
         <w:t xml:space="preserve">MCKINNEY, Wes. </w:t>
       </w:r>
       <w:r>
@@ -2087,6 +2512,105 @@
           <w:sz w:val="22"/>
         </w:rPr>
         <w:t>. 3. ed. São Paulo: Novatec, 2023.</w:t>
+      </w:r>
+    </w:p>
+    <w:p>
+      <w:pPr>
+        <w:spacing w:before="0" w:after="120" w:line="276" w:lineRule="auto"/>
+        <w:jc w:val="left"/>
+      </w:pPr>
+      <w:r>
+        <w:rPr>
+          <w:rFonts w:ascii="Source Sans Pro" w:hAnsi="Source Sans Pro" w:cs="Source Sans Pro"/>
+          <w:b w:val="0"/>
+          <w:i w:val="0"/>
+          <w:sz w:val="22"/>
+        </w:rPr>
+        <w:t xml:space="preserve">PINTO, Suzi Samá; SILVA, Carla Silva da. </w:t>
+      </w:r>
+      <w:r>
+        <w:rPr>
+          <w:rFonts w:ascii="Source Sans Pro" w:hAnsi="Source Sans Pro" w:cs="Source Sans Pro"/>
+          <w:b w:val="0"/>
+          <w:i/>
+          <w:sz w:val="22"/>
+        </w:rPr>
+        <w:t>Estatística: volume I</w:t>
+      </w:r>
+      <w:r>
+        <w:rPr>
+          <w:rFonts w:ascii="Source Sans Pro" w:hAnsi="Source Sans Pro" w:cs="Source Sans Pro"/>
+          <w:b w:val="0"/>
+          <w:i w:val="0"/>
+          <w:sz w:val="22"/>
+        </w:rPr>
+        <w:t>. Rio Grande: Editora da FURG, 2020.</w:t>
+      </w:r>
+    </w:p>
+    <w:p>
+      <w:pPr>
+        <w:spacing w:before="0" w:after="120" w:line="276" w:lineRule="auto"/>
+        <w:jc w:val="left"/>
+      </w:pPr>
+      <w:r>
+        <w:rPr>
+          <w:rFonts w:ascii="Source Sans Pro" w:hAnsi="Source Sans Pro" w:cs="Source Sans Pro"/>
+          <w:b w:val="0"/>
+          <w:i w:val="0"/>
+          <w:sz w:val="22"/>
+        </w:rPr>
+        <w:t xml:space="preserve">SILVA, Carla Silva da; SAMÁ, Suzi. </w:t>
+      </w:r>
+      <w:r>
+        <w:rPr>
+          <w:rFonts w:ascii="Source Sans Pro" w:hAnsi="Source Sans Pro" w:cs="Source Sans Pro"/>
+          <w:b w:val="0"/>
+          <w:i/>
+          <w:sz w:val="22"/>
+        </w:rPr>
+        <w:t>Estatística: volume II</w:t>
+      </w:r>
+      <w:r>
+        <w:rPr>
+          <w:rFonts w:ascii="Source Sans Pro" w:hAnsi="Source Sans Pro" w:cs="Source Sans Pro"/>
+          <w:b w:val="0"/>
+          <w:i w:val="0"/>
+          <w:sz w:val="22"/>
+        </w:rPr>
+        <w:t>. Rio Grande: Editora da FURG, 2021.</w:t>
+      </w:r>
+    </w:p>
+    <w:p>
+      <w:pPr>
+        <w:spacing w:before="0" w:after="120" w:line="276" w:lineRule="auto"/>
+        <w:jc w:val="left"/>
+      </w:pPr>
+      <w:r>
+        <w:rPr>
+          <w:rFonts w:ascii="Source Sans Pro" w:hAnsi="Source Sans Pro" w:cs="Source Sans Pro"/>
+          <w:b w:val="0"/>
+          <w:i w:val="0"/>
+          <w:sz w:val="22"/>
+        </w:rPr>
+        <w:t xml:space="preserve">VIEIRA, Sonia. </w:t>
+      </w:r>
+      <w:r>
+        <w:rPr>
+          <w:rFonts w:ascii="Source Sans Pro" w:hAnsi="Source Sans Pro" w:cs="Source Sans Pro"/>
+          <w:b w:val="0"/>
+          <w:i/>
+          <w:sz w:val="22"/>
+        </w:rPr>
+        <w:t>Elementos de estatística</w:t>
+      </w:r>
+      <w:r>
+        <w:rPr>
+          <w:rFonts w:ascii="Source Sans Pro" w:hAnsi="Source Sans Pro" w:cs="Source Sans Pro"/>
+          <w:b w:val="0"/>
+          <w:i w:val="0"/>
+          <w:sz w:val="22"/>
+        </w:rPr>
+        <w:t>. 4. ed. São Paulo: Atlas, 2003.</w:t>
       </w:r>
     </w:p>
     <w:sectPr>

</xml_diff>